<commit_message>
Thesis Chapter 4: formal-analysis wording aligned with Chapter 3, live scenarios described as run, lifecycle definition completed
Co-Authored-By: Claude Fable 5.1 <noreply@anthropic.com>
Claude-Session: https://claude.ai/code/session_01QHSSv245Aernyaebt7V5kS
</commit_message>
<xml_diff>
--- a/docs/Yasir_Thesis_Chapter4.docx
+++ b/docs/Yasir_Thesis_Chapter4.docx
@@ -160,7 +160,7 @@
         <w:rPr>
           <w:color w:val="FF0000"/>
         </w:rPr>
-        <w:t>Lifecycle state. The state of a consent at a point in time: pending until the guardians have approved, active while it can release data, and expired or revoked when it no longer can.</w:t>
+        <w:t>Lifecycle state. The state of a consent at a point in time: pending until the guardians have approved, not started before its start time, active while it can release data, and expired or revoked when it no longer can.</w:t>
       </w:r>
     </w:p>
     <w:p>
@@ -889,7 +889,7 @@
         <w:rPr>
           <w:color w:val="FF0000"/>
         </w:rPr>
-        <w:t>RQ6 asks how the security properties of the authorisation mechanism can be formally defined and empirically evaluated to show that the implemented framework enforces authorised and unauthorised decisions correctly. The solution of RO6 has two parts that complement each other. The formal part defines the security properties of the integrated decision, authorisation integrity, threshold authorisation security and lifecycle safety, and analyses them under stated assumptions. The empirical part evaluates the HALAH prototype through scenarios in which the expected and the observed decisions are compared, and through attack scenarios in which each trust condition is deliberately bypassed. Algorithm 6 defines this validation procedure, and Chapter 10 presents the formal properties, the prototype, the scenarios, the measured results and the attack scenarios.</w:t>
+        <w:t>RQ6 asks how the security properties of the authorisation mechanism can be formally defined and empirically evaluated to show that the implemented framework enforces authorised and unauthorised decisions correctly. The solution of RO6 has two parts that complement each other. The formal part defines the security properties of the integrated decision, authorisation integrity, threshold authorisation security and lifecycle safety, and states the assumptions under which they are analysed. The empirical part evaluates the HALAH prototype through scenarios in which the expected and the observed decisions are compared, and through attack scenarios in which each trust condition is deliberately bypassed. Algorithm 6 defines this validation procedure, and Chapter 10 presents the formal properties, the prototype, the scenarios, the measured results and the attack scenarios.</w:t>
       </w:r>
     </w:p>
     <w:p>
@@ -909,7 +909,7 @@
         <w:rPr>
           <w:color w:val="FF0000"/>
         </w:rPr>
-        <w:t>The prototype is tested at three levels. Live scenarios run the whole workflow through the web interface: a consent is created, each guardian approves, the authorised doctor is allowed, a doctor who is not named in the consent is refused, a request outside the data scope is refused, and a request after revocation is refused. Automated tests, 46 in all, check each predicate on its own and together, including twelve attack scenarios, A1 to A12, in which a signer outside G, a replayed signature, a duplicate approval, an over-scope or empty request, a request outside the validity window, a request after revocation, a tampered proof and a forged credential are each refused. The processing time of each check is measured so that the cost of the decision is known. Every decision, allowed or refused, is written to the audit ledger with the result of the five predicates, and the ledger is the evidence used in Chapter 10.</w:t>
+        <w:t>The prototype is tested at three levels. Live scenarios run the whole workflow through the web interface: a consent is created, each guardian approves, the authorised doctor is allowed, a request that does not satisfy the conditions of the consent is refused, and a request after revocation is refused. Automated tests, 46 in all, check each predicate on its own and together, including twelve attack scenarios, A1 to A12, in which a signer outside G, a replayed signature, a duplicate approval, an over-scope or empty request, a request outside the validity window, a request after revocation, a tampered proof and a forged credential are each refused. The processing time of each check is measured so that the cost of the decision is known. Every decision, allowed or refused, is written to the audit ledger with the result of the five predicates, and the ledger is the evidence used in Chapter 10.</w:t>
       </w:r>
     </w:p>
     <w:p>

</xml_diff>